<commit_message>
End of the project
</commit_message>
<xml_diff>
--- a/CSD5873 REPORT.docx
+++ b/CSD5873 REPORT.docx
@@ -3,6 +3,11 @@
 <w:document xmlns:wpc="http://schemas.microsoft.com/office/word/2010/wordprocessingCanvas" xmlns:cx="http://schemas.microsoft.com/office/drawing/2014/chartex" xmlns:cx1="http://schemas.microsoft.com/office/drawing/2015/9/8/chartex" xmlns:cx2="http://schemas.microsoft.com/office/drawing/2015/10/21/chartex" xmlns:cx3="http://schemas.microsoft.com/office/drawing/2016/5/9/chartex" xmlns:cx4="http://schemas.microsoft.com/office/drawing/2016/5/10/chartex" xmlns:cx5="http://schemas.microsoft.com/office/drawing/2016/5/11/chartex" xmlns:cx6="http://schemas.microsoft.com/office/drawing/2016/5/12/chartex" xmlns:cx7="http://schemas.microsoft.com/office/drawing/2016/5/13/chartex" xmlns:cx8="http://schemas.microsoft.com/office/drawing/2016/5/14/chartex" xmlns:mc="http://schemas.openxmlformats.org/markup-compatibility/2006" xmlns:aink="http://schemas.microsoft.com/office/drawing/2016/ink" xmlns:am3d="http://schemas.microsoft.com/office/drawing/2017/model3d" xmlns:o="urn:schemas-microsoft-com:office:office" xmlns:oel="http://schemas.microsoft.com/office/2019/extlst" xmlns:r="http://schemas.openxmlformats.org/officeDocument/2006/relationships" xmlns:m="http://schemas.openxmlformats.org/officeDocument/2006/math" xmlns:v="urn:schemas-microsoft-com:vml" xmlns:wp14="http://schemas.microsoft.com/office/word/2010/wordprocessingDrawing" xmlns:wp="http://schemas.openxmlformats.org/drawingml/2006/wordprocessingDrawing" xmlns:w10="urn:schemas-microsoft-com:office:word" xmlns:w="http://schemas.openxmlformats.org/wordprocessingml/2006/main" xmlns:w14="http://schemas.microsoft.com/office/word/2010/wordml" xmlns:w15="http://schemas.microsoft.com/office/word/2012/wordml" xmlns:w16cex="http://schemas.microsoft.com/office/word/2018/wordml/cex" xmlns:w16cid="http://schemas.microsoft.com/office/word/2016/wordml/cid" xmlns:w16="http://schemas.microsoft.com/office/word/2018/wordml" xmlns:w16du="http://schemas.microsoft.com/office/word/2023/wordml/word16du" xmlns:w16sdtdh="http://schemas.microsoft.com/office/word/2020/wordml/sdtdatahash" xmlns:w16sdtfl="http://schemas.microsoft.com/office/word/2024/wordml/sdtformatlock" xmlns:w16se="http://schemas.microsoft.com/office/word/2015/wordml/symex" xmlns:wpg="http://schemas.microsoft.com/office/word/2010/wordprocessingGroup" xmlns:wpi="http://schemas.microsoft.com/office/word/2010/wordprocessingInk" xmlns:wne="http://schemas.microsoft.com/office/word/2006/wordml" xmlns:wps="http://schemas.microsoft.com/office/word/2010/wordprocessingShape" mc:Ignorable="w14 w15 w16se w16cid w16 w16cex w16sdtdh w16sdtfl w16du wp14">
   <w:body>
     <w:p>
+      <w:pPr>
+        <w:rPr>
+          <w:lang w:val="el-GR"/>
+        </w:rPr>
+      </w:pPr>
       <w:r>
         <w:rPr>
           <w:noProof/>
@@ -286,14 +291,27 @@
           </wp:anchor>
         </w:drawing>
       </w:r>
-    </w:p>
-    <w:p/>
+      <w:r>
+        <w:rPr>
+          <w:lang w:val="el-GR"/>
+        </w:rPr>
+        <w:t>χ</w:t>
+      </w:r>
+    </w:p>
+    <w:p>
+      <w:pPr>
+        <w:rPr>
+          <w:lang w:val="el-GR"/>
+        </w:rPr>
+      </w:pPr>
+    </w:p>
     <w:p>
       <w:pPr>
         <w:rPr>
           <w:b/>
           <w:sz w:val="36"/>
           <w:szCs w:val="36"/>
+          <w:lang w:val="el-GR"/>
         </w:rPr>
       </w:pPr>
     </w:p>
@@ -370,7 +388,7 @@
                         <a:effectLst/>
                         <a:extLst>
                           <a:ext uri="{AF507438-7753-43e0-B8FC-AC1667EBCBE1}">
-                            <a14:hiddenEffects xmlns:o="urn:schemas-microsoft-com:office:office" xmlns:v="urn:schemas-microsoft-com:vml" xmlns:w10="urn:schemas-microsoft-com:office:word" xmlns:w="http://schemas.openxmlformats.org/wordprocessingml/2006/main" xmlns:a14="http://schemas.microsoft.com/office/drawing/2010/main" xmlns="">
+                            <a14:hiddenEffects xmlns="" xmlns:a14="http://schemas.microsoft.com/office/drawing/2010/main" xmlns:w="http://schemas.openxmlformats.org/wordprocessingml/2006/main" xmlns:w10="urn:schemas-microsoft-com:office:word" xmlns:v="urn:schemas-microsoft-com:vml" xmlns:o="urn:schemas-microsoft-com:office:office">
                               <a:effectLst>
                                 <a:outerShdw blurRad="63500" dist="46662" dir="3284183" algn="ctr" rotWithShape="0">
                                   <a:srgbClr val="1F2F3F">
@@ -520,7 +538,7 @@
           <w:b/>
           <w:sz w:val="28"/>
           <w:szCs w:val="28"/>
-          <w:lang w:val="el-GR"/>
+          <w:lang w:val="en-GB"/>
         </w:rPr>
       </w:pPr>
       <w:r>
@@ -530,16 +548,16 @@
           <w:szCs w:val="28"/>
           <w:lang w:val="el-GR"/>
         </w:rPr>
-        <w:t>Χειμερινό Εξάμηνο 20</w:t>
+        <w:t>Χειμερινό</w:t>
       </w:r>
       <w:r>
         <w:rPr>
           <w:b/>
           <w:sz w:val="28"/>
           <w:szCs w:val="28"/>
-          <w:lang w:val="el-GR"/>
-        </w:rPr>
-        <w:t>20</w:t>
+          <w:lang w:val="en-GB"/>
+        </w:rPr>
+        <w:t xml:space="preserve"> </w:t>
       </w:r>
       <w:r>
         <w:rPr>
@@ -548,23 +566,41 @@
           <w:szCs w:val="28"/>
           <w:lang w:val="el-GR"/>
         </w:rPr>
-        <w:t>-20</w:t>
+        <w:t>Εξάμηνο</w:t>
       </w:r>
       <w:r>
         <w:rPr>
           <w:b/>
           <w:sz w:val="28"/>
           <w:szCs w:val="28"/>
-          <w:lang w:val="el-GR"/>
-        </w:rPr>
-        <w:t>2</w:t>
+          <w:lang w:val="en-GB"/>
+        </w:rPr>
+        <w:t xml:space="preserve"> 20</w:t>
       </w:r>
       <w:r>
         <w:rPr>
           <w:b/>
           <w:sz w:val="28"/>
           <w:szCs w:val="28"/>
-          <w:lang w:val="el-GR"/>
+          <w:lang w:val="en-GB"/>
+        </w:rPr>
+        <w:t>20</w:t>
+      </w:r>
+      <w:r>
+        <w:rPr>
+          <w:b/>
+          <w:sz w:val="28"/>
+          <w:szCs w:val="28"/>
+          <w:lang w:val="en-GB"/>
+        </w:rPr>
+        <w:t>-202</w:t>
+      </w:r>
+      <w:r>
+        <w:rPr>
+          <w:b/>
+          <w:sz w:val="28"/>
+          <w:szCs w:val="28"/>
+          <w:lang w:val="en-GB"/>
         </w:rPr>
         <w:t>1</w:t>
       </w:r>
@@ -573,35 +609,35 @@
       <w:pPr>
         <w:pStyle w:val="-11"/>
         <w:rPr>
-          <w:lang w:val="el-GR"/>
-        </w:rPr>
-      </w:pPr>
-    </w:p>
-    <w:p>
-      <w:pPr>
-        <w:rPr>
-          <w:lang w:val="el-GR"/>
-        </w:rPr>
-      </w:pPr>
-    </w:p>
-    <w:p>
-      <w:pPr>
-        <w:rPr>
-          <w:lang w:val="el-GR"/>
-        </w:rPr>
-      </w:pPr>
-    </w:p>
-    <w:p>
-      <w:pPr>
-        <w:rPr>
-          <w:lang w:val="el-GR"/>
-        </w:rPr>
-      </w:pPr>
-    </w:p>
-    <w:p>
-      <w:pPr>
-        <w:rPr>
-          <w:lang w:val="el-GR"/>
+          <w:lang w:val="en-GB"/>
+        </w:rPr>
+      </w:pPr>
+    </w:p>
+    <w:p>
+      <w:pPr>
+        <w:rPr>
+          <w:lang w:val="en-GB"/>
+        </w:rPr>
+      </w:pPr>
+    </w:p>
+    <w:p>
+      <w:pPr>
+        <w:rPr>
+          <w:lang w:val="en-GB"/>
+        </w:rPr>
+      </w:pPr>
+    </w:p>
+    <w:p>
+      <w:pPr>
+        <w:rPr>
+          <w:lang w:val="en-GB"/>
+        </w:rPr>
+      </w:pPr>
+    </w:p>
+    <w:p>
+      <w:pPr>
+        <w:rPr>
+          <w:lang w:val="en-GB"/>
         </w:rPr>
       </w:pPr>
     </w:p>
@@ -609,7 +645,7 @@
       <w:pPr>
         <w:pStyle w:val="-11"/>
         <w:rPr>
-          <w:lang w:val="el-GR"/>
+          <w:lang w:val="en-GB"/>
         </w:rPr>
       </w:pPr>
       <w:r>
@@ -655,14 +691,14 @@
                         </a:ln>
                         <a:extLst>
                           <a:ext uri="{909E8E84-426E-40dd-AFC4-6F175D3DCCD1}">
-                            <a14:hiddenFill xmlns:o="urn:schemas-microsoft-com:office:office" xmlns:v="urn:schemas-microsoft-com:vml" xmlns:w10="urn:schemas-microsoft-com:office:word" xmlns:w="http://schemas.openxmlformats.org/wordprocessingml/2006/main" xmlns:a14="http://schemas.microsoft.com/office/drawing/2010/main" xmlns="">
+                            <a14:hiddenFill xmlns="" xmlns:a14="http://schemas.microsoft.com/office/drawing/2010/main" xmlns:w="http://schemas.openxmlformats.org/wordprocessingml/2006/main" xmlns:w10="urn:schemas-microsoft-com:office:word" xmlns:v="urn:schemas-microsoft-com:vml" xmlns:o="urn:schemas-microsoft-com:office:office">
                               <a:solidFill>
                                 <a:srgbClr val="FFFFFF"/>
                               </a:solidFill>
                             </a14:hiddenFill>
                           </a:ext>
                           <a:ext uri="{91240B29-F687-4f45-9708-019B960494DF}">
-                            <a14:hiddenLine xmlns:o="urn:schemas-microsoft-com:office:office" xmlns:v="urn:schemas-microsoft-com:vml" xmlns:w10="urn:schemas-microsoft-com:office:word" xmlns:w="http://schemas.openxmlformats.org/wordprocessingml/2006/main" xmlns:a14="http://schemas.microsoft.com/office/drawing/2010/main" xmlns="" w="9525">
+                            <a14:hiddenLine xmlns="" xmlns:a14="http://schemas.microsoft.com/office/drawing/2010/main" xmlns:w="http://schemas.openxmlformats.org/wordprocessingml/2006/main" xmlns:w10="urn:schemas-microsoft-com:office:word" xmlns:v="urn:schemas-microsoft-com:vml" xmlns:o="urn:schemas-microsoft-com:office:office" w="9525">
                               <a:solidFill>
                                 <a:srgbClr val="000000"/>
                               </a:solidFill>
@@ -759,12 +795,12 @@
           <w:tab w:val="left" w:pos="1680"/>
         </w:tabs>
         <w:rPr>
-          <w:lang w:val="el-GR"/>
-        </w:rPr>
-      </w:pPr>
-      <w:r>
-        <w:rPr>
-          <w:lang w:val="el-GR"/>
+          <w:lang w:val="en-GB"/>
+        </w:rPr>
+      </w:pPr>
+      <w:r>
+        <w:rPr>
+          <w:lang w:val="en-GB"/>
         </w:rPr>
         <w:tab/>
       </w:r>
@@ -1023,14 +1059,14 @@
                         </a:ln>
                         <a:extLst>
                           <a:ext uri="{909E8E84-426E-40dd-AFC4-6F175D3DCCD1}">
-                            <a14:hiddenFill xmlns:o="urn:schemas-microsoft-com:office:office" xmlns:v="urn:schemas-microsoft-com:vml" xmlns:w10="urn:schemas-microsoft-com:office:word" xmlns:w="http://schemas.openxmlformats.org/wordprocessingml/2006/main" xmlns:a14="http://schemas.microsoft.com/office/drawing/2010/main" xmlns="">
+                            <a14:hiddenFill xmlns="" xmlns:a14="http://schemas.microsoft.com/office/drawing/2010/main" xmlns:w="http://schemas.openxmlformats.org/wordprocessingml/2006/main" xmlns:w10="urn:schemas-microsoft-com:office:word" xmlns:v="urn:schemas-microsoft-com:vml" xmlns:o="urn:schemas-microsoft-com:office:office">
                               <a:solidFill>
                                 <a:srgbClr val="FFFFFF"/>
                               </a:solidFill>
                             </a14:hiddenFill>
                           </a:ext>
                           <a:ext uri="{91240B29-F687-4f45-9708-019B960494DF}">
-                            <a14:hiddenLine xmlns:o="urn:schemas-microsoft-com:office:office" xmlns:v="urn:schemas-microsoft-com:vml" xmlns:w10="urn:schemas-microsoft-com:office:word" xmlns:w="http://schemas.openxmlformats.org/wordprocessingml/2006/main" xmlns:a14="http://schemas.microsoft.com/office/drawing/2010/main" xmlns="" w="9525">
+                            <a14:hiddenLine xmlns="" xmlns:a14="http://schemas.microsoft.com/office/drawing/2010/main" xmlns:w="http://schemas.openxmlformats.org/wordprocessingml/2006/main" xmlns:w10="urn:schemas-microsoft-com:office:word" xmlns:v="urn:schemas-microsoft-com:vml" xmlns:o="urn:schemas-microsoft-com:office:office" w="9525">
                               <a:solidFill>
                                 <a:srgbClr val="000000"/>
                               </a:solidFill>
@@ -2718,47 +2754,28 @@
         <w:rPr>
           <w:lang w:val="el-GR"/>
         </w:rPr>
-        <w:t xml:space="preserve"> Περιλαμβάνει τη μέθοδο </w:t>
-      </w:r>
-      <w:proofErr w:type="spellStart"/>
-      <w:r>
-        <w:rPr>
-          <w:lang w:val="en-GB"/>
-        </w:rPr>
-        <w:t>calculatePoints</w:t>
-      </w:r>
-      <w:proofErr w:type="spellEnd"/>
-      <w:r>
-        <w:rPr>
-          <w:lang w:val="el-GR"/>
-        </w:rPr>
-        <w:t>(), η οποία ορίζεται ως αφηρημένη (</w:t>
-      </w:r>
-      <w:r>
-        <w:rPr>
-          <w:lang w:val="en-GB"/>
-        </w:rPr>
-        <w:t>abstract</w:t>
-      </w:r>
-      <w:r>
-        <w:rPr>
-          <w:lang w:val="el-GR"/>
-        </w:rPr>
-        <w:t xml:space="preserve">). Στη Β' Φάση, κάθε </w:t>
-      </w:r>
-      <w:proofErr w:type="spellStart"/>
-      <w:r>
-        <w:rPr>
-          <w:lang w:val="el-GR"/>
-        </w:rPr>
-        <w:t>υποκλάση</w:t>
-      </w:r>
-      <w:proofErr w:type="spellEnd"/>
-      <w:r>
-        <w:rPr>
-          <w:lang w:val="el-GR"/>
-        </w:rPr>
-        <w:t xml:space="preserve"> θα υλοποιήσει τη δική της λογική βαθμολόγησης σύμφωνα με τους κανόνες (π.χ. τα μωσαϊκά με βάση το χρώμα, οι σκελετοί με βάση τη συμπλήρωση οικογενειών).</w:t>
+        <w:t xml:space="preserve"> Η κλάση παρέχει τις βασικές μεθόδους για την ανάκτηση της διαδρομής της εικόνας. Τελικά, επιλέχθηκε να μην συμπεριληφθεί αφηρημένη μέθοδος βαθμολόγησης</w:t>
+      </w:r>
+      <w:r>
+        <w:rPr>
+          <w:lang w:val="el-GR"/>
+        </w:rPr>
+        <w:t xml:space="preserve"> </w:t>
+      </w:r>
+      <w:r>
+        <w:rPr>
+          <w:lang w:val="el-GR"/>
+        </w:rPr>
+        <w:t xml:space="preserve">στην κλάση </w:t>
+      </w:r>
+      <w:r>
+        <w:t>Tile</w:t>
+      </w:r>
+      <w:r>
+        <w:rPr>
+          <w:lang w:val="el-GR"/>
+        </w:rPr>
+        <w:t>. Ο λόγος είναι ότι στο παιχνίδι οι πόντοι προκύπτουν κυρίως από συνδυασμούς πλακιδίων</w:t>
       </w:r>
     </w:p>
     <w:p>
@@ -3234,7 +3251,13 @@
         <w:rPr>
           <w:lang w:val="el-GR"/>
         </w:rPr>
-        <w:t xml:space="preserve"> Οι </w:t>
+        <w:t xml:space="preserve"> </w:t>
+      </w:r>
+      <w:r>
+        <w:rPr>
+          <w:lang w:val="el-GR"/>
+        </w:rPr>
+        <w:t xml:space="preserve">"Οι </w:t>
       </w:r>
       <w:proofErr w:type="spellStart"/>
       <w:r>
@@ -3251,9 +3274,6 @@
         <w:t xml:space="preserve"> (</w:t>
       </w:r>
       <w:r>
-        <w:rPr>
-          <w:lang w:val="en-GB"/>
-        </w:rPr>
         <w:t>Assistant</w:t>
       </w:r>
       <w:r>
@@ -3262,14 +3282,9 @@
         </w:rPr>
         <w:t xml:space="preserve">, </w:t>
       </w:r>
-      <w:proofErr w:type="spellStart"/>
-      <w:r>
-        <w:rPr>
-          <w:lang w:val="en-GB"/>
-        </w:rPr>
-        <w:t>Archeologist</w:t>
-      </w:r>
-      <w:proofErr w:type="spellEnd"/>
+      <w:r>
+        <w:t>Archaeologist</w:t>
+      </w:r>
       <w:r>
         <w:rPr>
           <w:lang w:val="el-GR"/>
@@ -3277,9 +3292,6 @@
         <w:t xml:space="preserve">, </w:t>
       </w:r>
       <w:r>
-        <w:rPr>
-          <w:lang w:val="en-GB"/>
-        </w:rPr>
         <w:t>Digger</w:t>
       </w:r>
       <w:r>
@@ -3289,9 +3301,6 @@
         <w:t xml:space="preserve">, </w:t>
       </w:r>
       <w:r>
-        <w:rPr>
-          <w:lang w:val="en-GB"/>
-        </w:rPr>
         <w:t>Professor</w:t>
       </w:r>
       <w:r>
@@ -3301,9 +3310,6 @@
         <w:t xml:space="preserve">, </w:t>
       </w:r>
       <w:r>
-        <w:rPr>
-          <w:lang w:val="en-GB"/>
-        </w:rPr>
         <w:t>Coder</w:t>
       </w:r>
       <w:r>
@@ -3313,52 +3319,27 @@
         <w:t xml:space="preserve">) κληρονομούν από την </w:t>
       </w:r>
       <w:r>
-        <w:rPr>
-          <w:lang w:val="en-GB"/>
-        </w:rPr>
         <w:t>Character</w:t>
       </w:r>
       <w:r>
         <w:rPr>
           <w:lang w:val="el-GR"/>
         </w:rPr>
-        <w:t xml:space="preserve"> και η καθεμία θα υλοποιήσει στη Β' Φάση τη δική της μοναδική λογική για την άντληση πλακιδίων από το ταμπλό. Αυτό επιτρέπει στον </w:t>
-      </w:r>
-      <w:r>
-        <w:rPr>
-          <w:lang w:val="en-GB"/>
-        </w:rPr>
-        <w:t>Controller</w:t>
-      </w:r>
-      <w:r>
-        <w:rPr>
-          <w:lang w:val="el-GR"/>
-        </w:rPr>
-        <w:t xml:space="preserve"> να καλεί την ικανότητα οποιουδήποτε χαρακτήρα με ενιαίο τρόπο, χωρίς περίπλοκες δομές ελέγχου (</w:t>
-      </w:r>
-      <w:r>
-        <w:rPr>
-          <w:lang w:val="en-GB"/>
-        </w:rPr>
-        <w:t>if</w:t>
-      </w:r>
-      <w:r>
-        <w:rPr>
-          <w:lang w:val="el-GR"/>
-        </w:rPr>
-        <w:t>/</w:t>
-      </w:r>
-      <w:r>
-        <w:rPr>
-          <w:lang w:val="en-GB"/>
-        </w:rPr>
-        <w:t>else</w:t>
-      </w:r>
-      <w:r>
-        <w:rPr>
-          <w:lang w:val="el-GR"/>
-        </w:rPr>
-        <w:t>).</w:t>
+        <w:t xml:space="preserve"> και η καθεμία </w:t>
+      </w:r>
+      <w:r>
+        <w:rPr>
+          <w:b/>
+          <w:bCs/>
+          <w:lang w:val="el-GR"/>
+        </w:rPr>
+        <w:t>υλοποιεί</w:t>
+      </w:r>
+      <w:r>
+        <w:rPr>
+          <w:lang w:val="el-GR"/>
+        </w:rPr>
+        <w:t xml:space="preserve"> τη δική της μοναδική λογική για την άντληση πλακιδίων από το ταμπλό.</w:t>
       </w:r>
     </w:p>
     <w:p>
@@ -3698,7 +3679,6 @@
           <w:bCs/>
           <w:lang w:val="el-GR"/>
         </w:rPr>
-        <w:lastRenderedPageBreak/>
         <w:t>2.4. Παίκτης και Σακούλα (</w:t>
       </w:r>
       <w:r>
@@ -3751,6 +3731,7 @@
           <w:bCs/>
           <w:lang w:val="en-GB"/>
         </w:rPr>
+        <w:lastRenderedPageBreak/>
         <w:t>Class</w:t>
       </w:r>
       <w:r>
@@ -3809,45 +3790,7 @@
         <w:rPr>
           <w:lang w:val="el-GR"/>
         </w:rPr>
-        <w:t xml:space="preserve">). Η μέθοδος </w:t>
-      </w:r>
-      <w:r>
-        <w:rPr>
-          <w:lang w:val="en-GB"/>
-        </w:rPr>
-        <w:t>compute</w:t>
-      </w:r>
-      <w:r>
-        <w:rPr>
-          <w:lang w:val="el-GR"/>
-        </w:rPr>
-        <w:t>_</w:t>
-      </w:r>
-      <w:r>
-        <w:rPr>
-          <w:lang w:val="en-GB"/>
-        </w:rPr>
-        <w:t>points</w:t>
-      </w:r>
-      <w:r>
-        <w:rPr>
-          <w:lang w:val="el-GR"/>
-        </w:rPr>
-        <w:t xml:space="preserve">() θα υλοποιηθεί στη Β' Φάση για να υπολογίζει το τελικό σκορ διατρέχοντας τη λίστα των πλακιδίων και καλώντας την </w:t>
-      </w:r>
-      <w:proofErr w:type="spellStart"/>
-      <w:r>
-        <w:rPr>
-          <w:lang w:val="en-GB"/>
-        </w:rPr>
-        <w:t>calculatePoints</w:t>
-      </w:r>
-      <w:proofErr w:type="spellEnd"/>
-      <w:r>
-        <w:rPr>
-          <w:lang w:val="el-GR"/>
-        </w:rPr>
-        <w:t>() του καθενός.</w:t>
+        <w:t xml:space="preserve">). </w:t>
       </w:r>
     </w:p>
     <w:p>
@@ -3865,6 +3808,91 @@
         <w:rPr>
           <w:b/>
           <w:bCs/>
+          <w:lang w:val="el-GR"/>
+        </w:rPr>
+        <w:t xml:space="preserve">Η μέθοδος </w:t>
+      </w:r>
+      <w:r>
+        <w:rPr>
+          <w:b/>
+          <w:bCs/>
+        </w:rPr>
+        <w:t>compute</w:t>
+      </w:r>
+      <w:r>
+        <w:rPr>
+          <w:b/>
+          <w:bCs/>
+          <w:lang w:val="el-GR"/>
+        </w:rPr>
+        <w:t>_</w:t>
+      </w:r>
+      <w:r>
+        <w:rPr>
+          <w:b/>
+          <w:bCs/>
+        </w:rPr>
+        <w:t>points</w:t>
+      </w:r>
+      <w:r>
+        <w:rPr>
+          <w:b/>
+          <w:bCs/>
+          <w:lang w:val="el-GR"/>
+        </w:rPr>
+        <w:t>():</w:t>
+      </w:r>
+      <w:r>
+        <w:rPr>
+          <w:lang w:val="el-GR"/>
+        </w:rPr>
+        <w:t xml:space="preserve"> Υλοποιεί τον κεντρικό μηχανισμό βαθμολόγησης. Η μέθοδος διατρέχει τη λίστα </w:t>
+      </w:r>
+      <w:proofErr w:type="spellStart"/>
+      <w:r>
+        <w:t>collectedTiles</w:t>
+      </w:r>
+      <w:proofErr w:type="spellEnd"/>
+      <w:r>
+        <w:rPr>
+          <w:lang w:val="el-GR"/>
+        </w:rPr>
+        <w:t xml:space="preserve"> του παίκτη και ελέγχει τον τύπο του κάθε πλακιδίου</w:t>
+      </w:r>
+      <w:r>
+        <w:rPr>
+          <w:lang w:val="el-GR"/>
+        </w:rPr>
+        <w:t xml:space="preserve">. </w:t>
+      </w:r>
+      <w:r>
+        <w:rPr>
+          <w:lang w:val="el-GR"/>
+        </w:rPr>
+        <w:t>Στη συνέχεια, μετράει τα πλακίδια κάθε κατηγορίας και υπολογίζει το συνολικό σκορ εφαρμόζοντας τους κανόνες για τα σετ και τις πλειοψηφίες</w:t>
+      </w:r>
+      <w:r>
+        <w:rPr>
+          <w:lang w:val="el-GR"/>
+        </w:rPr>
+        <w:t>.</w:t>
+      </w:r>
+    </w:p>
+    <w:p>
+      <w:pPr>
+        <w:numPr>
+          <w:ilvl w:val="0"/>
+          <w:numId w:val="11"/>
+        </w:numPr>
+        <w:jc w:val="both"/>
+        <w:rPr>
+          <w:lang w:val="el-GR"/>
+        </w:rPr>
+      </w:pPr>
+      <w:r>
+        <w:rPr>
+          <w:b/>
+          <w:bCs/>
           <w:lang w:val="en-GB"/>
         </w:rPr>
         <w:t>Class</w:t>
@@ -4413,19 +4441,36 @@
         <w:rPr>
           <w:lang w:val="el-GR"/>
         </w:rPr>
-        <w:t xml:space="preserve">Στην Α' Φάση, έχουν σχεδιαστεί οι ακόλουθες μέθοδοι για την κλάση </w:t>
-      </w:r>
-      <w:r>
-        <w:rPr>
-          <w:lang w:val="en-GB"/>
-        </w:rPr>
+        <w:t xml:space="preserve">Στην κλάση </w:t>
+      </w:r>
+      <w:r>
         <w:t>Controller</w:t>
       </w:r>
       <w:r>
         <w:rPr>
           <w:lang w:val="el-GR"/>
         </w:rPr>
-        <w:t>, οι οποίες καλύπτουν τη ροή του παιχνιδιού:</w:t>
+        <w:t xml:space="preserve"> </w:t>
+      </w:r>
+      <w:r>
+        <w:rPr>
+          <w:b/>
+          <w:bCs/>
+          <w:lang w:val="el-GR"/>
+        </w:rPr>
+        <w:t>έχουν υλοποιηθεί</w:t>
+      </w:r>
+      <w:r>
+        <w:rPr>
+          <w:lang w:val="el-GR"/>
+        </w:rPr>
+        <w:t xml:space="preserve"> οι ακόλουθες μέθοδοι, οι οποίες καλύπτουν τη ροή του παιχνιδιού</w:t>
+      </w:r>
+      <w:r>
+        <w:rPr>
+          <w:lang w:val="el-GR"/>
+        </w:rPr>
+        <w:t>:</w:t>
       </w:r>
     </w:p>
     <w:p>
@@ -4517,6 +4562,7 @@
           <w:bCs/>
           <w:lang w:val="en-GB"/>
         </w:rPr>
+        <w:lastRenderedPageBreak/>
         <w:t>startTurn</w:t>
       </w:r>
       <w:proofErr w:type="spellEnd"/>
@@ -4563,7 +4609,6 @@
           <w:bCs/>
           <w:lang w:val="en-GB"/>
         </w:rPr>
-        <w:lastRenderedPageBreak/>
         <w:t>handleLandslide</w:t>
       </w:r>
       <w:proofErr w:type="spellEnd"/>
@@ -5015,97 +5060,7 @@
     </w:p>
     <w:p>
       <w:pPr>
-        <w:rPr>
-          <w:color w:val="auto"/>
-          <w:lang w:val="el-GR"/>
-        </w:rPr>
-      </w:pPr>
-    </w:p>
-    <w:p>
-      <w:pPr>
-        <w:rPr>
-          <w:lang w:val="el-GR"/>
-        </w:rPr>
-      </w:pPr>
-      <w:r>
-        <w:rPr>
-          <w:lang w:val="el-GR"/>
-        </w:rPr>
-        <w:t xml:space="preserve">Ορίστε η ενότητα </w:t>
-      </w:r>
-      <w:r>
-        <w:rPr>
-          <w:b/>
-          <w:bCs/>
-          <w:lang w:val="el-GR"/>
-        </w:rPr>
-        <w:t xml:space="preserve">"4. Η Σχεδίαση και οι Κλάσεις του Πακέτου </w:t>
-      </w:r>
-      <w:r>
-        <w:rPr>
-          <w:b/>
-          <w:bCs/>
-          <w:lang w:val="en-GB"/>
-        </w:rPr>
-        <w:t>View</w:t>
-      </w:r>
-      <w:r>
-        <w:rPr>
-          <w:b/>
-          <w:bCs/>
-          <w:lang w:val="el-GR"/>
-        </w:rPr>
-        <w:t>"</w:t>
-      </w:r>
-      <w:r>
-        <w:rPr>
-          <w:lang w:val="el-GR"/>
-        </w:rPr>
-        <w:t>, προσαρμοσμένη ώστε να είναι περιεκτική και σωστή για την Α' Φάση, χωρίς να πλατειάζει, ακριβώς όπως ζητήσατε.</w:t>
-      </w:r>
-    </w:p>
-    <w:p>
-      <w:pPr>
-        <w:rPr>
-          <w:lang w:val="en-GB"/>
-        </w:rPr>
-      </w:pPr>
-      <w:r>
-        <w:rPr>
-          <w:lang w:val="en-GB"/>
-        </w:rPr>
-        <w:pict w14:anchorId="1FB3E3D4">
-          <v:rect id="_x0000_i1025" style="width:0;height:1.5pt" o:hralign="center" o:hrstd="t" o:hr="t" fillcolor="#a0a0a0" stroked="f"/>
-        </w:pict>
-      </w:r>
-    </w:p>
-    <w:p>
-      <w:pPr>
-        <w:rPr>
-          <w:b/>
-          <w:bCs/>
-          <w:lang w:val="el-GR"/>
-        </w:rPr>
-      </w:pPr>
-      <w:r>
-        <w:rPr>
-          <w:b/>
-          <w:bCs/>
-          <w:lang w:val="el-GR"/>
-        </w:rPr>
-        <w:t xml:space="preserve">4. Η Σχεδίαση και οι Κλάσεις του Πακέτου </w:t>
-      </w:r>
-      <w:r>
-        <w:rPr>
-          <w:b/>
-          <w:bCs/>
-          <w:lang w:val="en-GB"/>
-        </w:rPr>
-        <w:t>View</w:t>
-      </w:r>
-    </w:p>
-    <w:p>
-      <w:pPr>
+        <w:ind w:firstLine="360"/>
         <w:rPr>
           <w:lang w:val="el-GR"/>
         </w:rPr>
@@ -5254,14 +5209,12 @@
         </w:rPr>
         <w:t xml:space="preserve">, η οποία κληρονομεί από την κλάση </w:t>
       </w:r>
-      <w:proofErr w:type="spellStart"/>
       <w:r>
         <w:rPr>
           <w:lang w:val="en-GB"/>
         </w:rPr>
         <w:t>JFrame</w:t>
       </w:r>
-      <w:proofErr w:type="spellEnd"/>
       <w:r>
         <w:rPr>
           <w:lang w:val="el-GR"/>
@@ -5391,7 +5344,6 @@
           <w:bCs/>
           <w:lang w:val="el-GR"/>
         </w:rPr>
-        <w:lastRenderedPageBreak/>
         <w:t>Περιοχή Πληροφοριών:</w:t>
       </w:r>
       <w:r>
@@ -5494,6 +5446,7 @@
           <w:bCs/>
           <w:lang w:val="el-GR"/>
         </w:rPr>
+        <w:lastRenderedPageBreak/>
         <w:t>4.2. Βασικές Μέθοδοι και Επικοινωνία</w:t>
       </w:r>
     </w:p>
@@ -6272,82 +6225,82 @@
           <w:bCs/>
           <w:lang w:val="el-GR"/>
         </w:rPr>
+        <w:t>Συσχέτιση Παικτών-Αντικειμένων:</w:t>
+      </w:r>
+      <w:r>
+        <w:rPr>
+          <w:lang w:val="el-GR"/>
+        </w:rPr>
+        <w:t xml:space="preserve"> Η σχέση "</w:t>
+      </w:r>
+      <w:r>
+        <w:rPr>
+          <w:lang w:val="en-GB"/>
+        </w:rPr>
+        <w:t>Has</w:t>
+      </w:r>
+      <w:r>
+        <w:rPr>
+          <w:lang w:val="el-GR"/>
+        </w:rPr>
+        <w:t>-</w:t>
+      </w:r>
+      <w:r>
+        <w:rPr>
+          <w:lang w:val="en-GB"/>
+        </w:rPr>
+        <w:t>A</w:t>
+      </w:r>
+      <w:r>
+        <w:rPr>
+          <w:lang w:val="el-GR"/>
+        </w:rPr>
+        <w:t xml:space="preserve">" μεταξύ του </w:t>
+      </w:r>
+      <w:r>
+        <w:rPr>
+          <w:lang w:val="en-GB"/>
+        </w:rPr>
+        <w:t>Player</w:t>
+      </w:r>
+      <w:r>
+        <w:rPr>
+          <w:lang w:val="el-GR"/>
+        </w:rPr>
+        <w:t xml:space="preserve"> και των </w:t>
+      </w:r>
+      <w:r>
+        <w:rPr>
+          <w:lang w:val="en-GB"/>
+        </w:rPr>
+        <w:t>Character</w:t>
+      </w:r>
+      <w:r>
+        <w:rPr>
+          <w:lang w:val="el-GR"/>
+        </w:rPr>
+        <w:t xml:space="preserve"> καρτών δείχνει ότι κάθε παίκτης έχει τη δική του αποκλειστική ομάδα χαρακτήρων.</w:t>
+      </w:r>
+    </w:p>
+    <w:p>
+      <w:pPr>
+        <w:rPr>
+          <w:lang w:val="el-GR"/>
+        </w:rPr>
+      </w:pPr>
+    </w:p>
+    <w:p>
+      <w:pPr>
+        <w:rPr>
+          <w:lang w:val="el-GR"/>
+        </w:rPr>
+      </w:pPr>
+      <w:r>
+        <w:rPr>
+          <w:noProof/>
+          <w:lang w:val="el-GR"/>
+        </w:rPr>
         <w:lastRenderedPageBreak/>
-        <w:t>Συσχέτιση Παικτών-Αντικειμένων:</w:t>
-      </w:r>
-      <w:r>
-        <w:rPr>
-          <w:lang w:val="el-GR"/>
-        </w:rPr>
-        <w:t xml:space="preserve"> Η σχέση "</w:t>
-      </w:r>
-      <w:r>
-        <w:rPr>
-          <w:lang w:val="en-GB"/>
-        </w:rPr>
-        <w:t>Has</w:t>
-      </w:r>
-      <w:r>
-        <w:rPr>
-          <w:lang w:val="el-GR"/>
-        </w:rPr>
-        <w:t>-</w:t>
-      </w:r>
-      <w:r>
-        <w:rPr>
-          <w:lang w:val="en-GB"/>
-        </w:rPr>
-        <w:t>A</w:t>
-      </w:r>
-      <w:r>
-        <w:rPr>
-          <w:lang w:val="el-GR"/>
-        </w:rPr>
-        <w:t xml:space="preserve">" μεταξύ του </w:t>
-      </w:r>
-      <w:r>
-        <w:rPr>
-          <w:lang w:val="en-GB"/>
-        </w:rPr>
-        <w:t>Player</w:t>
-      </w:r>
-      <w:r>
-        <w:rPr>
-          <w:lang w:val="el-GR"/>
-        </w:rPr>
-        <w:t xml:space="preserve"> και των </w:t>
-      </w:r>
-      <w:r>
-        <w:rPr>
-          <w:lang w:val="en-GB"/>
-        </w:rPr>
-        <w:t>Character</w:t>
-      </w:r>
-      <w:r>
-        <w:rPr>
-          <w:lang w:val="el-GR"/>
-        </w:rPr>
-        <w:t xml:space="preserve"> καρτών δείχνει ότι κάθε παίκτης έχει τη δική του αποκλειστική ομάδα χαρακτήρων.</w:t>
-      </w:r>
-    </w:p>
-    <w:p>
-      <w:pPr>
-        <w:rPr>
-          <w:lang w:val="el-GR"/>
-        </w:rPr>
-      </w:pPr>
-    </w:p>
-    <w:p>
-      <w:pPr>
-        <w:rPr>
-          <w:lang w:val="el-GR"/>
-        </w:rPr>
-      </w:pPr>
-      <w:r>
-        <w:rPr>
-          <w:noProof/>
-          <w:lang w:val="el-GR"/>
-        </w:rPr>
         <w:drawing>
           <wp:inline distT="0" distB="0" distL="0" distR="0" wp14:anchorId="0B71E0A2" wp14:editId="33592B58">
             <wp:extent cx="5158105" cy="2714625"/>
@@ -6427,15 +6380,312 @@
       <w:pPr>
         <w:jc w:val="both"/>
         <w:rPr>
-          <w:lang w:val="el-GR"/>
-        </w:rPr>
-      </w:pPr>
-      <w:r>
-        <w:rPr>
-          <w:lang w:val="el-GR"/>
-        </w:rPr>
-        <w:t>Σε αυτήν την ενότητα θα γράψετε στη Β φάση ποια ερωτήματα καταφέρατε να υλοποιήσετε είτε επιτυχώς είτε εν μέρει (και ενδεχομένως ποια όχι).</w:t>
-      </w:r>
+          <w:lang w:val="en-GB"/>
+        </w:rPr>
+      </w:pPr>
+      <w:r>
+        <w:rPr>
+          <w:lang w:val="el-GR"/>
+        </w:rPr>
+        <w:t xml:space="preserve">Στο πλαίσιο της ολοκλήρωσης του </w:t>
+      </w:r>
+      <w:r>
+        <w:rPr>
+          <w:lang w:val="en-GB"/>
+        </w:rPr>
+        <w:t>project</w:t>
+      </w:r>
+      <w:r>
+        <w:rPr>
+          <w:lang w:val="el-GR"/>
+        </w:rPr>
+        <w:t xml:space="preserve">, υλοποιήθηκαν επιτυχώς όλες οι απαιτήσεις του παιχνιδιού. </w:t>
+      </w:r>
+      <w:proofErr w:type="spellStart"/>
+      <w:r>
+        <w:rPr>
+          <w:lang w:val="en-GB"/>
+        </w:rPr>
+        <w:t>Συγκεκριμέν</w:t>
+      </w:r>
+      <w:proofErr w:type="spellEnd"/>
+      <w:r>
+        <w:rPr>
+          <w:lang w:val="en-GB"/>
+        </w:rPr>
+        <w:t>α:</w:t>
+      </w:r>
+    </w:p>
+    <w:p>
+      <w:pPr>
+        <w:numPr>
+          <w:ilvl w:val="0"/>
+          <w:numId w:val="18"/>
+        </w:numPr>
+        <w:jc w:val="both"/>
+        <w:rPr>
+          <w:lang w:val="el-GR"/>
+        </w:rPr>
+      </w:pPr>
+      <w:r>
+        <w:rPr>
+          <w:b/>
+          <w:bCs/>
+          <w:lang w:val="el-GR"/>
+        </w:rPr>
+        <w:t>Μηχανισμοί Παιχνιδιού:</w:t>
+      </w:r>
+      <w:r>
+        <w:rPr>
+          <w:lang w:val="el-GR"/>
+        </w:rPr>
+        <w:t xml:space="preserve"> Υλοποιήθηκε πλήρως η ροή των γύρων, το τράβηγμα πλακιδίων, η διαχείριση της κατολίσθησης (</w:t>
+      </w:r>
+      <w:r>
+        <w:rPr>
+          <w:lang w:val="en-GB"/>
+        </w:rPr>
+        <w:t>Landslide</w:t>
+      </w:r>
+      <w:r>
+        <w:rPr>
+          <w:lang w:val="el-GR"/>
+        </w:rPr>
+        <w:t>) και ο τερματισμός όταν γεμίσει η Είσοδος.</w:t>
+      </w:r>
+    </w:p>
+    <w:p>
+      <w:pPr>
+        <w:numPr>
+          <w:ilvl w:val="0"/>
+          <w:numId w:val="18"/>
+        </w:numPr>
+        <w:jc w:val="both"/>
+        <w:rPr>
+          <w:lang w:val="el-GR"/>
+        </w:rPr>
+      </w:pPr>
+      <w:r>
+        <w:rPr>
+          <w:b/>
+          <w:bCs/>
+          <w:lang w:val="el-GR"/>
+        </w:rPr>
+        <w:t>Χαρακτήρες:</w:t>
+      </w:r>
+      <w:r>
+        <w:rPr>
+          <w:lang w:val="el-GR"/>
+        </w:rPr>
+        <w:t xml:space="preserve"> Όλοι οι χαρακτήρες (</w:t>
+      </w:r>
+      <w:r>
+        <w:rPr>
+          <w:lang w:val="en-GB"/>
+        </w:rPr>
+        <w:t>Assistant</w:t>
+      </w:r>
+      <w:r>
+        <w:rPr>
+          <w:lang w:val="el-GR"/>
+        </w:rPr>
+        <w:t xml:space="preserve">, </w:t>
+      </w:r>
+      <w:r>
+        <w:rPr>
+          <w:lang w:val="en-GB"/>
+        </w:rPr>
+        <w:t>Archaeologist</w:t>
+      </w:r>
+      <w:r>
+        <w:rPr>
+          <w:lang w:val="el-GR"/>
+        </w:rPr>
+        <w:t xml:space="preserve">, </w:t>
+      </w:r>
+      <w:r>
+        <w:rPr>
+          <w:lang w:val="en-GB"/>
+        </w:rPr>
+        <w:t>Digger</w:t>
+      </w:r>
+      <w:r>
+        <w:rPr>
+          <w:lang w:val="el-GR"/>
+        </w:rPr>
+        <w:t xml:space="preserve">, </w:t>
+      </w:r>
+      <w:r>
+        <w:rPr>
+          <w:lang w:val="en-GB"/>
+        </w:rPr>
+        <w:t>Professor</w:t>
+      </w:r>
+      <w:r>
+        <w:rPr>
+          <w:lang w:val="el-GR"/>
+        </w:rPr>
+        <w:t xml:space="preserve">, </w:t>
+      </w:r>
+      <w:r>
+        <w:rPr>
+          <w:lang w:val="en-GB"/>
+        </w:rPr>
+        <w:t>Coder</w:t>
+      </w:r>
+      <w:r>
+        <w:rPr>
+          <w:lang w:val="el-GR"/>
+        </w:rPr>
+        <w:t>) λειτουργούν σωστά σύμφωνα με τους κανόνες, χρησιμοποιώντας τις ειδικές τους ικανότητες.</w:t>
+      </w:r>
+    </w:p>
+    <w:p>
+      <w:pPr>
+        <w:numPr>
+          <w:ilvl w:val="0"/>
+          <w:numId w:val="18"/>
+        </w:numPr>
+        <w:jc w:val="both"/>
+        <w:rPr>
+          <w:lang w:val="el-GR"/>
+        </w:rPr>
+      </w:pPr>
+      <w:r>
+        <w:rPr>
+          <w:b/>
+          <w:bCs/>
+          <w:lang w:val="el-GR"/>
+        </w:rPr>
+        <w:t>Βαθμολογία:</w:t>
+      </w:r>
+      <w:r>
+        <w:rPr>
+          <w:lang w:val="el-GR"/>
+        </w:rPr>
+        <w:t xml:space="preserve"> Ο υπολογισμός των πόντων γίνεται σωστά για όλες τις κατηγορίες (Μωσαϊκά, Αγάλματα, Αμφορείς, Σκελετοί), λαμβάνοντας υπόψη τα σετ και τις πλειοψηφίες.</w:t>
+      </w:r>
+    </w:p>
+    <w:p>
+      <w:pPr>
+        <w:numPr>
+          <w:ilvl w:val="0"/>
+          <w:numId w:val="18"/>
+        </w:numPr>
+        <w:jc w:val="both"/>
+        <w:rPr>
+          <w:lang w:val="el-GR"/>
+        </w:rPr>
+      </w:pPr>
+      <w:r>
+        <w:rPr>
+          <w:b/>
+          <w:bCs/>
+          <w:lang w:val="en-GB"/>
+        </w:rPr>
+        <w:t>Extra</w:t>
+      </w:r>
+      <w:r>
+        <w:rPr>
+          <w:b/>
+          <w:bCs/>
+          <w:lang w:val="el-GR"/>
+        </w:rPr>
+        <w:t xml:space="preserve"> Λειτουργίες:</w:t>
+      </w:r>
+      <w:r>
+        <w:rPr>
+          <w:lang w:val="el-GR"/>
+        </w:rPr>
+        <w:t xml:space="preserve"> Προστέθηκε η δυνατότητα Αποθήκευσης/Φόρτωσης (</w:t>
+      </w:r>
+      <w:r>
+        <w:rPr>
+          <w:lang w:val="en-GB"/>
+        </w:rPr>
+        <w:t>Save</w:t>
+      </w:r>
+      <w:r>
+        <w:rPr>
+          <w:lang w:val="el-GR"/>
+        </w:rPr>
+        <w:t>/</w:t>
+      </w:r>
+      <w:r>
+        <w:rPr>
+          <w:lang w:val="en-GB"/>
+        </w:rPr>
+        <w:t>Load</w:t>
+      </w:r>
+      <w:r>
+        <w:rPr>
+          <w:lang w:val="el-GR"/>
+        </w:rPr>
+        <w:t xml:space="preserve">) του παιχνιδιού, καθώς και λειτουργία </w:t>
+      </w:r>
+      <w:r>
+        <w:rPr>
+          <w:lang w:val="en-GB"/>
+        </w:rPr>
+        <w:t>Single</w:t>
+      </w:r>
+      <w:r>
+        <w:rPr>
+          <w:lang w:val="el-GR"/>
+        </w:rPr>
+        <w:t xml:space="preserve"> </w:t>
+      </w:r>
+      <w:r>
+        <w:rPr>
+          <w:lang w:val="en-GB"/>
+        </w:rPr>
+        <w:t>Player</w:t>
+      </w:r>
+      <w:r>
+        <w:rPr>
+          <w:lang w:val="el-GR"/>
+        </w:rPr>
+        <w:t xml:space="preserve"> με αντίπαλο τον "Κλέφτη" (</w:t>
+      </w:r>
+      <w:r>
+        <w:rPr>
+          <w:lang w:val="en-GB"/>
+        </w:rPr>
+        <w:t>Thief</w:t>
+      </w:r>
+      <w:r>
+        <w:rPr>
+          <w:lang w:val="el-GR"/>
+        </w:rPr>
+        <w:t>).</w:t>
+      </w:r>
+    </w:p>
+    <w:p>
+      <w:pPr>
+        <w:jc w:val="both"/>
+        <w:rPr>
+          <w:color w:val="auto"/>
+          <w:lang w:val="el-GR"/>
+        </w:rPr>
+      </w:pPr>
+    </w:p>
+    <w:p>
+      <w:pPr>
+        <w:jc w:val="both"/>
+        <w:rPr>
+          <w:color w:val="auto"/>
+          <w:lang w:val="el-GR"/>
+        </w:rPr>
+      </w:pPr>
+    </w:p>
+    <w:p>
+      <w:pPr>
+        <w:jc w:val="both"/>
+        <w:rPr>
+          <w:color w:val="auto"/>
+          <w:lang w:val="el-GR"/>
+        </w:rPr>
+      </w:pPr>
     </w:p>
     <w:p>
       <w:pPr>
@@ -6462,6 +6712,7 @@
         <w:rPr>
           <w:lang w:val="el-GR"/>
         </w:rPr>
+        <w:lastRenderedPageBreak/>
         <w:t>Συμπεράσματα</w:t>
       </w:r>
       <w:bookmarkEnd w:id="7"/>
@@ -6801,18 +7052,7 @@
           <w:szCs w:val="22"/>
           <w:lang w:val="el-GR"/>
         </w:rPr>
-        <w:t xml:space="preserve">. Αυτό μείωσε την </w:t>
-      </w:r>
-      <w:r>
-        <w:rPr>
-          <w:i w:val="0"/>
-          <w:iCs/>
-          <w:sz w:val="22"/>
-          <w:szCs w:val="22"/>
-          <w:lang w:val="el-GR"/>
-        </w:rPr>
-        <w:lastRenderedPageBreak/>
-        <w:t xml:space="preserve">πολυπλοκότητα του κώδικα στον </w:t>
+        <w:t xml:space="preserve">. Αυτό μείωσε την πολυπλοκότητα του κώδικα στον </w:t>
       </w:r>
       <w:r>
         <w:rPr>
@@ -7426,7 +7666,7 @@
                       </a:ln>
                       <a:extLst>
                         <a:ext uri="{909E8E84-426E-40dd-AFC4-6F175D3DCCD1}">
-                          <a14:hiddenFill xmlns:o="urn:schemas-microsoft-com:office:office" xmlns:v="urn:schemas-microsoft-com:vml" xmlns:w10="urn:schemas-microsoft-com:office:word" xmlns:w="http://schemas.openxmlformats.org/wordprocessingml/2006/main" xmlns:a14="http://schemas.microsoft.com/office/drawing/2010/main" xmlns="">
+                          <a14:hiddenFill xmlns="" xmlns:a14="http://schemas.microsoft.com/office/drawing/2010/main" xmlns:w="http://schemas.openxmlformats.org/wordprocessingml/2006/main" xmlns:w10="urn:schemas-microsoft-com:office:word" xmlns:v="urn:schemas-microsoft-com:vml" xmlns:o="urn:schemas-microsoft-com:office:office">
                             <a:noFill/>
                           </a14:hiddenFill>
                         </a:ext>
@@ -9055,6 +9295,155 @@
     </w:lvl>
   </w:abstractNum>
   <w:abstractNum w:abstractNumId="12" w15:restartNumberingAfterBreak="0">
+    <w:nsid w:val="4BF25AF0"/>
+    <w:multiLevelType w:val="multilevel"/>
+    <w:tmpl w:val="E26C07C8"/>
+    <w:lvl w:ilvl="0">
+      <w:start w:val="1"/>
+      <w:numFmt w:val="bullet"/>
+      <w:lvlText w:val=""/>
+      <w:lvlJc w:val="left"/>
+      <w:pPr>
+        <w:tabs>
+          <w:tab w:val="num" w:pos="720"/>
+        </w:tabs>
+        <w:ind w:left="720" w:hanging="360"/>
+      </w:pPr>
+      <w:rPr>
+        <w:rFonts w:ascii="Symbol" w:hAnsi="Symbol" w:hint="default"/>
+        <w:sz w:val="20"/>
+      </w:rPr>
+    </w:lvl>
+    <w:lvl w:ilvl="1" w:tentative="1">
+      <w:start w:val="1"/>
+      <w:numFmt w:val="bullet"/>
+      <w:lvlText w:val="o"/>
+      <w:lvlJc w:val="left"/>
+      <w:pPr>
+        <w:tabs>
+          <w:tab w:val="num" w:pos="1440"/>
+        </w:tabs>
+        <w:ind w:left="1440" w:hanging="360"/>
+      </w:pPr>
+      <w:rPr>
+        <w:rFonts w:ascii="Courier New" w:hAnsi="Courier New" w:hint="default"/>
+        <w:sz w:val="20"/>
+      </w:rPr>
+    </w:lvl>
+    <w:lvl w:ilvl="2" w:tentative="1">
+      <w:start w:val="1"/>
+      <w:numFmt w:val="bullet"/>
+      <w:lvlText w:val=""/>
+      <w:lvlJc w:val="left"/>
+      <w:pPr>
+        <w:tabs>
+          <w:tab w:val="num" w:pos="2160"/>
+        </w:tabs>
+        <w:ind w:left="2160" w:hanging="360"/>
+      </w:pPr>
+      <w:rPr>
+        <w:rFonts w:ascii="Wingdings" w:hAnsi="Wingdings" w:hint="default"/>
+        <w:sz w:val="20"/>
+      </w:rPr>
+    </w:lvl>
+    <w:lvl w:ilvl="3" w:tentative="1">
+      <w:start w:val="1"/>
+      <w:numFmt w:val="bullet"/>
+      <w:lvlText w:val=""/>
+      <w:lvlJc w:val="left"/>
+      <w:pPr>
+        <w:tabs>
+          <w:tab w:val="num" w:pos="2880"/>
+        </w:tabs>
+        <w:ind w:left="2880" w:hanging="360"/>
+      </w:pPr>
+      <w:rPr>
+        <w:rFonts w:ascii="Wingdings" w:hAnsi="Wingdings" w:hint="default"/>
+        <w:sz w:val="20"/>
+      </w:rPr>
+    </w:lvl>
+    <w:lvl w:ilvl="4" w:tentative="1">
+      <w:start w:val="1"/>
+      <w:numFmt w:val="bullet"/>
+      <w:lvlText w:val=""/>
+      <w:lvlJc w:val="left"/>
+      <w:pPr>
+        <w:tabs>
+          <w:tab w:val="num" w:pos="3600"/>
+        </w:tabs>
+        <w:ind w:left="3600" w:hanging="360"/>
+      </w:pPr>
+      <w:rPr>
+        <w:rFonts w:ascii="Wingdings" w:hAnsi="Wingdings" w:hint="default"/>
+        <w:sz w:val="20"/>
+      </w:rPr>
+    </w:lvl>
+    <w:lvl w:ilvl="5" w:tentative="1">
+      <w:start w:val="1"/>
+      <w:numFmt w:val="bullet"/>
+      <w:lvlText w:val=""/>
+      <w:lvlJc w:val="left"/>
+      <w:pPr>
+        <w:tabs>
+          <w:tab w:val="num" w:pos="4320"/>
+        </w:tabs>
+        <w:ind w:left="4320" w:hanging="360"/>
+      </w:pPr>
+      <w:rPr>
+        <w:rFonts w:ascii="Wingdings" w:hAnsi="Wingdings" w:hint="default"/>
+        <w:sz w:val="20"/>
+      </w:rPr>
+    </w:lvl>
+    <w:lvl w:ilvl="6" w:tentative="1">
+      <w:start w:val="1"/>
+      <w:numFmt w:val="bullet"/>
+      <w:lvlText w:val=""/>
+      <w:lvlJc w:val="left"/>
+      <w:pPr>
+        <w:tabs>
+          <w:tab w:val="num" w:pos="5040"/>
+        </w:tabs>
+        <w:ind w:left="5040" w:hanging="360"/>
+      </w:pPr>
+      <w:rPr>
+        <w:rFonts w:ascii="Wingdings" w:hAnsi="Wingdings" w:hint="default"/>
+        <w:sz w:val="20"/>
+      </w:rPr>
+    </w:lvl>
+    <w:lvl w:ilvl="7" w:tentative="1">
+      <w:start w:val="1"/>
+      <w:numFmt w:val="bullet"/>
+      <w:lvlText w:val=""/>
+      <w:lvlJc w:val="left"/>
+      <w:pPr>
+        <w:tabs>
+          <w:tab w:val="num" w:pos="5760"/>
+        </w:tabs>
+        <w:ind w:left="5760" w:hanging="360"/>
+      </w:pPr>
+      <w:rPr>
+        <w:rFonts w:ascii="Wingdings" w:hAnsi="Wingdings" w:hint="default"/>
+        <w:sz w:val="20"/>
+      </w:rPr>
+    </w:lvl>
+    <w:lvl w:ilvl="8" w:tentative="1">
+      <w:start w:val="1"/>
+      <w:numFmt w:val="bullet"/>
+      <w:lvlText w:val=""/>
+      <w:lvlJc w:val="left"/>
+      <w:pPr>
+        <w:tabs>
+          <w:tab w:val="num" w:pos="6480"/>
+        </w:tabs>
+        <w:ind w:left="6480" w:hanging="360"/>
+      </w:pPr>
+      <w:rPr>
+        <w:rFonts w:ascii="Wingdings" w:hAnsi="Wingdings" w:hint="default"/>
+        <w:sz w:val="20"/>
+      </w:rPr>
+    </w:lvl>
+  </w:abstractNum>
+  <w:abstractNum w:abstractNumId="13" w15:restartNumberingAfterBreak="0">
     <w:nsid w:val="51B14642"/>
     <w:multiLevelType w:val="multilevel"/>
     <w:tmpl w:val="0916F5E0"/>
@@ -9203,7 +9592,7 @@
       </w:rPr>
     </w:lvl>
   </w:abstractNum>
-  <w:abstractNum w:abstractNumId="13" w15:restartNumberingAfterBreak="0">
+  <w:abstractNum w:abstractNumId="14" w15:restartNumberingAfterBreak="0">
     <w:nsid w:val="64060D20"/>
     <w:multiLevelType w:val="multilevel"/>
     <w:tmpl w:val="85360A12"/>
@@ -9352,7 +9741,7 @@
       </w:rPr>
     </w:lvl>
   </w:abstractNum>
-  <w:abstractNum w:abstractNumId="14" w15:restartNumberingAfterBreak="0">
+  <w:abstractNum w:abstractNumId="15" w15:restartNumberingAfterBreak="0">
     <w:nsid w:val="78940B73"/>
     <w:multiLevelType w:val="multilevel"/>
     <w:tmpl w:val="F7227EA4"/>
@@ -9501,7 +9890,7 @@
       </w:rPr>
     </w:lvl>
   </w:abstractNum>
-  <w:abstractNum w:abstractNumId="15" w15:restartNumberingAfterBreak="0">
+  <w:abstractNum w:abstractNumId="16" w15:restartNumberingAfterBreak="0">
     <w:nsid w:val="7CF34137"/>
     <w:multiLevelType w:val="hybridMultilevel"/>
     <w:tmpl w:val="1660BE54"/>
@@ -9587,7 +9976,7 @@
       </w:pPr>
     </w:lvl>
   </w:abstractNum>
-  <w:abstractNum w:abstractNumId="16" w15:restartNumberingAfterBreak="0">
+  <w:abstractNum w:abstractNumId="17" w15:restartNumberingAfterBreak="0">
     <w:nsid w:val="7F552428"/>
     <w:multiLevelType w:val="multilevel"/>
     <w:tmpl w:val="7A34B3AC"/>
@@ -9746,7 +10135,7 @@
     <w:abstractNumId w:val="9"/>
   </w:num>
   <w:num w:numId="4" w16cid:durableId="1092314197">
-    <w:abstractNumId w:val="15"/>
+    <w:abstractNumId w:val="16"/>
   </w:num>
   <w:num w:numId="5" w16cid:durableId="884801802">
     <w:abstractNumId w:val="7"/>
@@ -9755,13 +10144,13 @@
     <w:abstractNumId w:val="5"/>
   </w:num>
   <w:num w:numId="7" w16cid:durableId="1225946567">
-    <w:abstractNumId w:val="13"/>
+    <w:abstractNumId w:val="14"/>
   </w:num>
   <w:num w:numId="8" w16cid:durableId="1583446556">
     <w:abstractNumId w:val="10"/>
   </w:num>
   <w:num w:numId="9" w16cid:durableId="302391310">
-    <w:abstractNumId w:val="12"/>
+    <w:abstractNumId w:val="13"/>
   </w:num>
   <w:num w:numId="10" w16cid:durableId="1275210892">
     <w:abstractNumId w:val="0"/>
@@ -9773,10 +10162,10 @@
     <w:abstractNumId w:val="1"/>
   </w:num>
   <w:num w:numId="13" w16cid:durableId="1936206735">
-    <w:abstractNumId w:val="14"/>
+    <w:abstractNumId w:val="15"/>
   </w:num>
   <w:num w:numId="14" w16cid:durableId="711274112">
-    <w:abstractNumId w:val="16"/>
+    <w:abstractNumId w:val="17"/>
   </w:num>
   <w:num w:numId="15" w16cid:durableId="2023584621">
     <w:abstractNumId w:val="11"/>
@@ -9786,6 +10175,9 @@
   </w:num>
   <w:num w:numId="17" w16cid:durableId="595551642">
     <w:abstractNumId w:val="4"/>
+  </w:num>
+  <w:num w:numId="18" w16cid:durableId="1580361554">
+    <w:abstractNumId w:val="12"/>
   </w:num>
 </w:numbering>
 </file>
@@ -10354,7 +10746,6 @@
   <w:style w:type="character" w:default="1" w:styleId="DefaultParagraphFont">
     <w:name w:val="Default Paragraph Font"/>
     <w:uiPriority w:val="1"/>
-    <w:semiHidden/>
     <w:unhideWhenUsed/>
   </w:style>
   <w:style w:type="table" w:default="1" w:styleId="TableNormal">

</xml_diff>